<commit_message>
Polish lab 5 report wording and remove run date
</commit_message>
<xml_diff>
--- a/lab5/Отчёт_Лабораторная_5.docx
+++ b/lab5/Отчёт_Лабораторная_5.docx
@@ -1207,61 +1207,6 @@
           </w:p>
         </w:tc>
       </w:tr>
-      <w:tr>
-        <w:trPr>
-          <w:cantSplit/>
-        </w:trPr>
-        <w:tc>
-          <w:tcPr>
-            <w:tcW w:type="dxa" w:w="1814"/>
-            <w:tcBorders>
-              <w:top w:val="single" w:sz="4" w:color="CCCCCC"/>
-              <w:left w:val="single" w:sz="4" w:color="CCCCCC"/>
-              <w:bottom w:val="single" w:sz="4" w:color="CCCCCC"/>
-              <w:right w:val="single" w:sz="4" w:color="CCCCCC"/>
-            </w:tcBorders>
-          </w:tcPr>
-          <w:p>
-            <w:pPr>
-              <w:spacing w:after="60" w:before="60" w:line="252" w:lineRule="auto"/>
-            </w:pPr>
-            <w:r>
-              <w:rPr>
-                <w:rFonts w:ascii="Times New Roman" w:hAnsi="Times New Roman" w:eastAsia="Times New Roman"/>
-                <w:b w:val="0"/>
-                <w:color w:val="000000"/>
-                <w:sz w:val="20"/>
-              </w:rPr>
-              <w:t>Дата прогона</w:t>
-            </w:r>
-          </w:p>
-        </w:tc>
-        <w:tc>
-          <w:tcPr>
-            <w:tcW w:type="dxa" w:w="7540"/>
-            <w:tcBorders>
-              <w:top w:val="single" w:sz="4" w:color="CCCCCC"/>
-              <w:left w:val="single" w:sz="4" w:color="CCCCCC"/>
-              <w:bottom w:val="single" w:sz="4" w:color="CCCCCC"/>
-              <w:right w:val="single" w:sz="4" w:color="CCCCCC"/>
-            </w:tcBorders>
-          </w:tcPr>
-          <w:p>
-            <w:pPr>
-              <w:spacing w:after="60" w:before="60" w:line="252" w:lineRule="auto"/>
-            </w:pPr>
-            <w:r>
-              <w:rPr>
-                <w:rFonts w:ascii="Times New Roman" w:hAnsi="Times New Roman" w:eastAsia="Times New Roman"/>
-                <w:b w:val="0"/>
-                <w:color w:val="000000"/>
-                <w:sz w:val="20"/>
-              </w:rPr>
-              <w:t>16 октября 2026 года</w:t>
-            </w:r>
-          </w:p>
-        </w:tc>
-      </w:tr>
     </w:tbl>
     <w:p>
       <w:pPr>
@@ -1274,7 +1219,7 @@
           <w:color w:val="000000"/>
           <w:sz w:val="24"/>
         </w:rPr>
-        <w:t>Перед основным прогоном проверено состояние Ready через obmcutil state. При первом обращении во время загрузки отсутствовало PowerState; после завершения инициализации поле появилось. Ответы API и IPMI сохранены в results/environment.json.</w:t>
+        <w:t>Готовность стенда проверена командой obmcutil state. Ответы Redfish API и вывод IPMI сохранены в results/environment.json.</w:t>
       </w:r>
     </w:p>
     <w:p>
@@ -2784,7 +2729,7 @@
           <w:color w:val="000000"/>
           <w:sz w:val="24"/>
         </w:rPr>
-        <w:t>Два температурных сценария пропущены явно: Thermal/Temperatures содержит пустой массив. IPMI показывает CPU-объекты с дискретными/недоступными показаниями, а не температуру в Celsius. Пропуски не подтверждают норму температуры и не подтверждают согласованность двух интерфейсов.</w:t>
+        <w:t>Два температурных сценария пропущены: Thermal/Temperatures содержит пустой массив. IPMI показывает CPU-объекты с дискретными/недоступными показаниями, а не температуру в Celsius. Пропуски не подтверждают норму температуры и не подтверждают согласованность двух интерфейсов.</w:t>
       </w:r>
     </w:p>
     <w:p>

</xml_diff>

<commit_message>
Fix lab5 OpenBMC QEMU hardware profile and pass all Redfish tests
</commit_message>
<xml_diff>
--- a/lab5/Отчёт_Лабораторная_5.docx
+++ b/lab5/Отчёт_Лабораторная_5.docx
@@ -1037,7 +1037,7 @@
                 <w:color w:val="000000"/>
                 <w:sz w:val="20"/>
               </w:rPr>
-              <w:t>OpenBMC Romulus, образ от 02.09.2025, QEMU в Docker</w:t>
+              <w:t>OpenBMC Romulus, BUILD_ID 20250902012112; QEMU в Docker</w:t>
             </w:r>
           </w:p>
         </w:tc>
@@ -1219,7 +1219,7 @@
           <w:color w:val="000000"/>
           <w:sz w:val="24"/>
         </w:rPr>
-        <w:t>Готовность стенда проверена командой obmcutil state. Ответы Redfish API и вывод IPMI сохранены в results/environment.json.</w:t>
+        <w:t>Использован OpenBMC Romulus в QEMU с учебной моделью PSU/FSI/VRM и двумя входами hwmon. Службы OpenBMC обрабатывают запросы и состояния штатно; температуры 42/44 °C заданы моделью оборудования. Настройка воспроизводится скриптом setup_qemu_lab.py.</w:t>
       </w:r>
     </w:p>
     <w:p>
@@ -1573,7 +1573,7 @@
                 <w:color w:val="000000"/>
                 <w:sz w:val="20"/>
               </w:rPr>
-              <w:t>POST ResetType=On; HTTP 202/204; ожидание On; возврат к Off</w:t>
+              <w:t>Off → On; HTTP 202/204; подтверждение On; возврат исходного состояния</w:t>
             </w:r>
           </w:p>
         </w:tc>
@@ -1750,7 +1750,7 @@
           <w:color w:val="000000"/>
           <w:sz w:val="24"/>
         </w:rPr>
-        <w:t>Проверка температуры использует пороги самого датчика из Thermal/Temperatures. Отсутствующие или нечисловые показания не принимаются за норму. Для IPMI используется ipmitool sensor list с передачей пароля через переменную окружения; имена сопоставляются однозначно или через CPU_SENSOR_MAP.</w:t>
+        <w:t>Температура проверяется по порогам датчика из Thermal/Temperatures. Поддержаны имена CPU и OpenPOWER p0_core0_temp/p1_core0_temp. Отсутствующие или нечисловые показания считаются ошибкой. IPMI читается через ipmitool; сопоставление имён должно быть однозначным.</w:t>
       </w:r>
     </w:p>
     <w:p>
@@ -1944,7 +1944,7 @@
           <w:color w:val="000000"/>
           <w:sz w:val="19"/>
         </w:rPr>
-        <w:t>python -m pip install -r lab5/requirements.txt</w:t>
+        <w:t>python -m pip install -r lab5/requirements-stand.txt</w:t>
       </w:r>
     </w:p>
     <w:p>
@@ -2004,7 +2004,22 @@
           <w:color w:val="000000"/>
           <w:sz w:val="19"/>
         </w:rPr>
-        <w:t>bash lab5/run_tests.sh --allow-missing-sensors</w:t>
+        <w:t>python lab5/setup_qemu_lab.py install --qemu --build</w:t>
+      </w:r>
+    </w:p>
+    <w:p>
+      <w:pPr>
+        <w:spacing w:after="20" w:line="240" w:lineRule="auto"/>
+        <w:shd w:fill="F4F4F4"/>
+      </w:pPr>
+      <w:r>
+        <w:rPr>
+          <w:rFonts w:ascii="Consolas" w:hAnsi="Consolas" w:eastAsia="Consolas"/>
+          <w:b w:val="0"/>
+          <w:color w:val="000000"/>
+          <w:sz w:val="19"/>
+        </w:rPr>
+        <w:t>bash lab5/run_tests.sh</w:t>
       </w:r>
     </w:p>
     <w:p>
@@ -2250,7 +2265,7 @@
                 <w:color w:val="000000"/>
                 <w:sz w:val="20"/>
               </w:rPr>
-              <w:t>0.462 с</w:t>
+              <w:t>1.672 с</w:t>
             </w:r>
           </w:p>
         </w:tc>
@@ -2355,7 +2370,7 @@
                 <w:color w:val="000000"/>
                 <w:sz w:val="20"/>
               </w:rPr>
-              <w:t>0.225 с</w:t>
+              <w:t>0.570 с</w:t>
             </w:r>
           </w:p>
         </w:tc>
@@ -2435,7 +2450,7 @@
                 <w:color w:val="000000"/>
                 <w:sz w:val="20"/>
               </w:rPr>
-              <w:t>FAILED</w:t>
+              <w:t>PASSED</w:t>
             </w:r>
           </w:p>
         </w:tc>
@@ -2460,7 +2475,7 @@
                 <w:color w:val="000000"/>
                 <w:sz w:val="20"/>
               </w:rPr>
-              <w:t>106.124 с</w:t>
+              <w:t>35.506 с</w:t>
             </w:r>
           </w:p>
         </w:tc>
@@ -2540,7 +2555,7 @@
                 <w:color w:val="000000"/>
                 <w:sz w:val="20"/>
               </w:rPr>
-              <w:t>SKIPPED</w:t>
+              <w:t>PASSED</w:t>
             </w:r>
           </w:p>
         </w:tc>
@@ -2565,7 +2580,7 @@
                 <w:color w:val="000000"/>
                 <w:sz w:val="20"/>
               </w:rPr>
-              <w:t>1.128 с</w:t>
+              <w:t>0.502 с</w:t>
             </w:r>
           </w:p>
         </w:tc>
@@ -2645,7 +2660,7 @@
                 <w:color w:val="000000"/>
                 <w:sz w:val="20"/>
               </w:rPr>
-              <w:t>SKIPPED</w:t>
+              <w:t>PASSED</w:t>
             </w:r>
           </w:p>
         </w:tc>
@@ -2670,7 +2685,7 @@
                 <w:color w:val="000000"/>
                 <w:sz w:val="20"/>
               </w:rPr>
-              <w:t>0.130 с</w:t>
+              <w:t>25.425 с</w:t>
             </w:r>
           </w:p>
         </w:tc>
@@ -2687,7 +2702,7 @@
           <w:color w:val="000000"/>
           <w:sz w:val="24"/>
         </w:rPr>
-        <w:t>Всего проверок: 5. Протокол: results/pytest.log; машиночитаемый результат: results/junit.xml. Длительность прогона: 108.13 с.</w:t>
+        <w:t>Все 5 проверок пройдены: 5 PASSED, 0 FAILED, 0 SKIPPED. Длительность: 63.82 с. Протокол и JUnit XML сохранены в results/pytest.log и results/junit.xml.</w:t>
       </w:r>
     </w:p>
     <w:p>
@@ -2701,7 +2716,7 @@
           <w:color w:val="000000"/>
           <w:sz w:val="24"/>
         </w:rPr>
-        <w:t>Подтверждено создание сессии с HTTP 201, чтение системы с HTTP 200 и удаление сессии с HTTP 200. Исходный PowerState равен Off. Ответ операции On — HTTP 204. Результат проверки питания определяется достижением состояния On, а не только принятием команды.</w:t>
+        <w:t>Создание сессии вернуло HTTP 201, чтение системы — HTTP 200, удаление сессии — HTTP 200. После ResetType=On с HTTP 204 свежий GET подтвердил On. В finally выполнен ForceOff; исходное состояние Off восстановлено и проверено.</w:t>
       </w:r>
     </w:p>
     <w:p>
@@ -2715,7 +2730,7 @@
           <w:color w:val="000000"/>
           <w:sz w:val="24"/>
         </w:rPr>
-        <w:t>Проверка питания завершилась ошибкой: эмулируемый хост не достиг состояния On за отведённое время. Команда возврата к Off выполнена в finally. QEMU эмулирует контроллер BMC и не обеспечивает полноценную загрузку физического хоста. Ошибка сохранена в протоколе.</w:t>
+        <w:t>Оба CPU-датчика Enabled/OK: Redfish и IPMI возвращают 42 и 44 °C, по четыре порога соблюдены. В образе исправлен устаревший масштаб двух записей IPMI: штатный hwmon передаёт Celsius, а таблица ожидала миллиградусы. Исходники исправления включены в stand/.</w:t>
       </w:r>
     </w:p>
     <w:p>
@@ -2729,7 +2744,7 @@
           <w:color w:val="000000"/>
           <w:sz w:val="24"/>
         </w:rPr>
-        <w:t>Два температурных сценария пропущены: Thermal/Temperatures содержит пустой массив. IPMI показывает CPU-объекты с дискретными/недоступными показаниями, а не температуру в Celsius. Пропуски не подтверждают норму температуры и не подтверждают согласованность двух интерфейсов.</w:t>
+        <w:t>Дополнительно проверено обнаружение неисправностей: 95 °C вызывает Health=Critical и ошибку теста; неверное имя IPMI и отказ PSU также обнаруживаются. Ожидаемые ошибки сохранены отдельно в negative_*.log. Затем восстановлены входы стенда и выполнен успешный полный прогон.</w:t>
       </w:r>
     </w:p>
     <w:p>
@@ -2759,7 +2774,7 @@
           <w:color w:val="000000"/>
           <w:sz w:val="24"/>
         </w:rPr>
-        <w:t>Разработаны все пять предусмотренных сценариев, общая сессия, обработка ошибок и журналирование. Реальный прогон выявил ограничения образа Romulus в QEMU. Для завершения аппаратной проверки температуры требуется OpenBMC с доступными CPU-датчиками и IPMI-телеметрией; код запускается на таком стенде без разрешения пропусков.</w:t>
+        <w:t>Разработаны и выполнены все пять сценариев Redfish API: сессия, данные системы, питание, норма температуры и сравнение с IPMI. Пропусков нет. Управляемые неисправности подтверждают работоспособность проверок. Результаты относятся к ПО OpenBMC в QEMU с учебной моделью оборудования.</w:t>
       </w:r>
     </w:p>
     <w:p>

</xml_diff>